<commit_message>
fix: ownership UX, review submission gates and CRRF upload state
</commit_message>
<xml_diff>
--- a/docs/kyc-export-preview/complex/kyc-sample.docx
+++ b/docs/kyc-export-preview/complex/kyc-sample.docx
@@ -8163,7 +8163,7 @@
             </w:tblGrid>
             <w:tr>
               <w:trPr>
-                <w:cantSplit/>
+                <w:cantSplit w:val="off"/>
                 <w:trHeight w:val="400" w:hRule="atLeast"/>
               </w:trPr>
               <w:tc>
@@ -8468,7 +8468,7 @@
             </w:tr>
             <w:tr>
               <w:trPr>
-                <w:cantSplit/>
+                <w:cantSplit w:val="off"/>
                 <w:trHeight w:val="400" w:hRule="atLeast"/>
               </w:trPr>
               <w:tc>
@@ -8729,12 +8729,13 @@
             </w:tblGrid>
             <w:tr>
               <w:trPr>
-                <w:cantSplit/>
+                <w:cantSplit w:val="off"/>
                 <w:trHeight w:val="400" w:hRule="atLeast"/>
               </w:trPr>
               <w:tc>
                 <w:tcPr>
-                  <w:tcW w:type="dxa" w:w="4988"/>
+                  <w:tcW w:type="dxa" w:w="9976"/>
+                  <w:gridSpan w:val="2"/>
                   <w:tcMar>
                     <w:top w:type="dxa" w:w="50"/>
                     <w:left w:type="dxa" w:w="80"/>
@@ -8771,18 +8772,26 @@
                   </w:r>
                 </w:p>
               </w:tc>
-              <w:tc>
-                <w:tcPr>
-                  <w:tcW w:type="dxa" w:w="4988"/>
-                  <w:tcMar>
-                    <w:top w:type="dxa" w:w="50"/>
-                    <w:left w:type="dxa" w:w="80"/>
-                    <w:bottom w:type="dxa" w:w="40"/>
-                    <w:right w:type="dxa" w:w="80"/>
-                  </w:tcMar>
-                </w:tcPr>
-                <w:p>
-                  <w:pPr>
+            </w:tr>
+            <w:tr>
+              <w:trPr>
+                <w:cantSplit w:val="off"/>
+                <w:trHeight w:val="400" w:hRule="atLeast"/>
+              </w:trPr>
+              <w:tc>
+                <w:tcPr>
+                  <w:tcW w:type="dxa" w:w="9976"/>
+                  <w:gridSpan w:val="2"/>
+                  <w:tcMar>
+                    <w:top w:type="dxa" w:w="50"/>
+                    <w:left w:type="dxa" w:w="80"/>
+                    <w:bottom w:type="dxa" w:w="40"/>
+                    <w:right w:type="dxa" w:w="80"/>
+                  </w:tcMar>
+                </w:tcPr>
+                <w:p>
+                  <w:pPr>
+                    <w:keepNext/>
                     <w:spacing w:after="0" w:before="0" w:line="252" w:lineRule="auto"/>
                     <w:jc w:val="left"/>
                   </w:pPr>
@@ -8795,13 +8804,17 @@
                       <w:sz w:val="17"/>
                       <w:szCs w:val="17"/>
                     </w:rPr>
-                    <w:t xml:space="preserve">Comments: </w:t>
-                  </w:r>
-                  <w:r>
-                    <w:rPr>
-                      <w:rFonts w:ascii="Arial" w:cs="Arial" w:eastAsia="Arial" w:hAnsi="Arial"/>
-                      <w:b w:val="false"/>
-                      <w:bCs w:val="false"/>
+                    <w:t xml:space="preserve">Comments:</w:t>
+                  </w:r>
+                </w:p>
+                <w:p>
+                  <w:pPr>
+                    <w:spacing w:after="80" w:before="0" w:line="252" w:lineRule="auto"/>
+                    <w:jc w:val="left"/>
+                  </w:pPr>
+                  <w:r>
+                    <w:rPr>
+                      <w:rFonts w:ascii="Arial" w:cs="Arial" w:eastAsia="Arial" w:hAnsi="Arial"/>
                       <w:color w:val="0F172A"/>
                       <w:sz w:val="17"/>
                       <w:szCs w:val="17"/>
@@ -9055,12 +9068,13 @@
             </w:tr>
             <w:tr>
               <w:trPr>
-                <w:cantSplit/>
+                <w:cantSplit w:val="off"/>
                 <w:trHeight w:val="400" w:hRule="atLeast"/>
               </w:trPr>
               <w:tc>
                 <w:tcPr>
-                  <w:tcW w:type="dxa" w:w="4988"/>
+                  <w:tcW w:type="dxa" w:w="9976"/>
+                  <w:gridSpan w:val="2"/>
                   <w:tcMar>
                     <w:top w:type="dxa" w:w="50"/>
                     <w:left w:type="dxa" w:w="80"/>
@@ -9094,57 +9108,19 @@
                       <w:szCs w:val="17"/>
                     </w:rPr>
                     <w:t xml:space="preserve">Approve</w:t>
-                  </w:r>
-                </w:p>
-              </w:tc>
-              <w:tc>
-                <w:tcPr>
-                  <w:tcW w:type="dxa" w:w="4988"/>
-                  <w:tcMar>
-                    <w:top w:type="dxa" w:w="50"/>
-                    <w:left w:type="dxa" w:w="80"/>
-                    <w:bottom w:type="dxa" w:w="40"/>
-                    <w:right w:type="dxa" w:w="80"/>
-                  </w:tcMar>
-                </w:tcPr>
-                <w:p>
-                  <w:pPr>
-                    <w:spacing w:after="0" w:before="0" w:line="252" w:lineRule="auto"/>
-                    <w:jc w:val="left"/>
-                  </w:pPr>
-                  <w:r>
-                    <w:rPr>
-                      <w:rFonts w:ascii="Arial" w:cs="Arial" w:eastAsia="Arial" w:hAnsi="Arial"/>
-                      <w:b/>
-                      <w:bCs/>
-                      <w:color w:val="0F172A"/>
-                      <w:sz w:val="17"/>
-                      <w:szCs w:val="17"/>
-                    </w:rPr>
-                    <w:t xml:space="preserve">Conditions: </w:t>
-                  </w:r>
-                  <w:r>
-                    <w:rPr>
-                      <w:rFonts w:ascii="Arial" w:cs="Arial" w:eastAsia="Arial" w:hAnsi="Arial"/>
-                      <w:b w:val="false"/>
-                      <w:bCs w:val="false"/>
-                      <w:color w:val="0F172A"/>
-                      <w:sz w:val="17"/>
-                      <w:szCs w:val="17"/>
-                    </w:rPr>
-                    <w:t xml:space="preserve">-</w:t>
                   </w:r>
                 </w:p>
               </w:tc>
             </w:tr>
             <w:tr>
               <w:trPr>
-                <w:cantSplit/>
+                <w:cantSplit w:val="off"/>
                 <w:trHeight w:val="400" w:hRule="atLeast"/>
               </w:trPr>
               <w:tc>
                 <w:tcPr>
-                  <w:tcW w:type="dxa" w:w="4988"/>
+                  <w:tcW w:type="dxa" w:w="9976"/>
+                  <w:gridSpan w:val="2"/>
                   <w:tcMar>
                     <w:top w:type="dxa" w:w="50"/>
                     <w:left w:type="dxa" w:w="80"/>
@@ -9166,7 +9142,7 @@
                       <w:sz w:val="17"/>
                       <w:szCs w:val="17"/>
                     </w:rPr>
-                    <w:t xml:space="preserve">Reason: </w:t>
+                    <w:t xml:space="preserve">Conditions: </w:t>
                   </w:r>
                   <w:r>
                     <w:rPr>
@@ -9181,9 +9157,16 @@
                   </w:r>
                 </w:p>
               </w:tc>
-              <w:tc>
-                <w:tcPr>
-                  <w:tcW w:type="dxa" w:w="4988"/>
+            </w:tr>
+            <w:tr>
+              <w:trPr>
+                <w:cantSplit w:val="off"/>
+                <w:trHeight w:val="400" w:hRule="atLeast"/>
+              </w:trPr>
+              <w:tc>
+                <w:tcPr>
+                  <w:tcW w:type="dxa" w:w="9976"/>
+                  <w:gridSpan w:val="2"/>
                   <w:tcMar>
                     <w:top w:type="dxa" w:w="50"/>
                     <w:left w:type="dxa" w:w="80"/>
@@ -9205,13 +9188,64 @@
                       <w:sz w:val="17"/>
                       <w:szCs w:val="17"/>
                     </w:rPr>
-                    <w:t xml:space="preserve">Comments: </w:t>
-                  </w:r>
-                  <w:r>
-                    <w:rPr>
-                      <w:rFonts w:ascii="Arial" w:cs="Arial" w:eastAsia="Arial" w:hAnsi="Arial"/>
-                      <w:b w:val="false"/>
-                      <w:bCs w:val="false"/>
+                    <w:t xml:space="preserve">Reason: </w:t>
+                  </w:r>
+                  <w:r>
+                    <w:rPr>
+                      <w:rFonts w:ascii="Arial" w:cs="Arial" w:eastAsia="Arial" w:hAnsi="Arial"/>
+                      <w:b w:val="false"/>
+                      <w:bCs w:val="false"/>
+                      <w:color w:val="0F172A"/>
+                      <w:sz w:val="17"/>
+                      <w:szCs w:val="17"/>
+                    </w:rPr>
+                    <w:t xml:space="preserve">-</w:t>
+                  </w:r>
+                </w:p>
+              </w:tc>
+            </w:tr>
+            <w:tr>
+              <w:trPr>
+                <w:cantSplit w:val="off"/>
+                <w:trHeight w:val="400" w:hRule="atLeast"/>
+              </w:trPr>
+              <w:tc>
+                <w:tcPr>
+                  <w:tcW w:type="dxa" w:w="9976"/>
+                  <w:gridSpan w:val="2"/>
+                  <w:tcMar>
+                    <w:top w:type="dxa" w:w="50"/>
+                    <w:left w:type="dxa" w:w="80"/>
+                    <w:bottom w:type="dxa" w:w="40"/>
+                    <w:right w:type="dxa" w:w="80"/>
+                  </w:tcMar>
+                </w:tcPr>
+                <w:p>
+                  <w:pPr>
+                    <w:keepNext/>
+                    <w:spacing w:after="0" w:before="0" w:line="252" w:lineRule="auto"/>
+                    <w:jc w:val="left"/>
+                  </w:pPr>
+                  <w:r>
+                    <w:rPr>
+                      <w:rFonts w:ascii="Arial" w:cs="Arial" w:eastAsia="Arial" w:hAnsi="Arial"/>
+                      <w:b/>
+                      <w:bCs/>
+                      <w:color w:val="0F172A"/>
+                      <w:sz w:val="17"/>
+                      <w:szCs w:val="17"/>
+                    </w:rPr>
+                    <w:t xml:space="preserve">Comments:</w:t>
+                  </w:r>
+                </w:p>
+                <w:p>
+                  <w:pPr>
+                    <w:spacing w:after="80" w:before="0" w:line="252" w:lineRule="auto"/>
+                    <w:jc w:val="left"/>
+                  </w:pPr>
+                  <w:r>
+                    <w:rPr>
+                      <w:rFonts w:ascii="Arial" w:cs="Arial" w:eastAsia="Arial" w:hAnsi="Arial"/>
                       <w:color w:val="0F172A"/>
                       <w:sz w:val="17"/>
                       <w:szCs w:val="17"/>
@@ -9465,12 +9499,13 @@
             </w:tr>
             <w:tr>
               <w:trPr>
-                <w:cantSplit/>
+                <w:cantSplit w:val="off"/>
                 <w:trHeight w:val="400" w:hRule="atLeast"/>
               </w:trPr>
               <w:tc>
                 <w:tcPr>
-                  <w:tcW w:type="dxa" w:w="4988"/>
+                  <w:tcW w:type="dxa" w:w="9976"/>
+                  <w:gridSpan w:val="2"/>
                   <w:tcMar>
                     <w:top w:type="dxa" w:w="50"/>
                     <w:left w:type="dxa" w:w="80"/>
@@ -9504,57 +9539,19 @@
                       <w:szCs w:val="17"/>
                     </w:rPr>
                     <w:t xml:space="preserve">High</w:t>
-                  </w:r>
-                </w:p>
-              </w:tc>
-              <w:tc>
-                <w:tcPr>
-                  <w:tcW w:type="dxa" w:w="4988"/>
-                  <w:tcMar>
-                    <w:top w:type="dxa" w:w="50"/>
-                    <w:left w:type="dxa" w:w="80"/>
-                    <w:bottom w:type="dxa" w:w="40"/>
-                    <w:right w:type="dxa" w:w="80"/>
-                  </w:tcMar>
-                </w:tcPr>
-                <w:p>
-                  <w:pPr>
-                    <w:spacing w:after="0" w:before="0" w:line="252" w:lineRule="auto"/>
-                    <w:jc w:val="left"/>
-                  </w:pPr>
-                  <w:r>
-                    <w:rPr>
-                      <w:rFonts w:ascii="Arial" w:cs="Arial" w:eastAsia="Arial" w:hAnsi="Arial"/>
-                      <w:b/>
-                      <w:bCs/>
-                      <w:color w:val="0F172A"/>
-                      <w:sz w:val="17"/>
-                      <w:szCs w:val="17"/>
-                    </w:rPr>
-                    <w:t xml:space="preserve">Risk reason category: </w:t>
-                  </w:r>
-                  <w:r>
-                    <w:rPr>
-                      <w:rFonts w:ascii="Arial" w:cs="Arial" w:eastAsia="Arial" w:hAnsi="Arial"/>
-                      <w:b w:val="false"/>
-                      <w:bCs w:val="false"/>
-                      <w:color w:val="0F172A"/>
-                      <w:sz w:val="17"/>
-                      <w:szCs w:val="17"/>
-                    </w:rPr>
-                    <w:t xml:space="preserve">PEP exposure</w:t>
                   </w:r>
                 </w:p>
               </w:tc>
             </w:tr>
             <w:tr>
               <w:trPr>
-                <w:cantSplit/>
+                <w:cantSplit w:val="off"/>
                 <w:trHeight w:val="400" w:hRule="atLeast"/>
               </w:trPr>
               <w:tc>
                 <w:tcPr>
-                  <w:tcW w:type="dxa" w:w="4988"/>
+                  <w:tcW w:type="dxa" w:w="9976"/>
+                  <w:gridSpan w:val="2"/>
                   <w:tcMar>
                     <w:top w:type="dxa" w:w="50"/>
                     <w:left w:type="dxa" w:w="80"/>
@@ -9576,64 +9573,25 @@
                       <w:sz w:val="17"/>
                       <w:szCs w:val="17"/>
                     </w:rPr>
-                    <w:t xml:space="preserve">Risk explanation: </w:t>
-                  </w:r>
-                  <w:r>
-                    <w:rPr>
-                      <w:rFonts w:ascii="Arial" w:cs="Arial" w:eastAsia="Arial" w:hAnsi="Arial"/>
-                      <w:b w:val="false"/>
-                      <w:bCs w:val="false"/>
-                      <w:color w:val="0F172A"/>
-                      <w:sz w:val="17"/>
-                      <w:szCs w:val="17"/>
-                    </w:rPr>
-                    <w:t xml:space="preserve">Beneficial person is a domestic PEP.</w:t>
-                  </w:r>
-                </w:p>
-              </w:tc>
-              <w:tc>
-                <w:tcPr>
-                  <w:tcW w:type="dxa" w:w="4988"/>
-                  <w:tcMar>
-                    <w:top w:type="dxa" w:w="50"/>
-                    <w:left w:type="dxa" w:w="80"/>
-                    <w:bottom w:type="dxa" w:w="40"/>
-                    <w:right w:type="dxa" w:w="80"/>
-                  </w:tcMar>
-                </w:tcPr>
-                <w:p>
-                  <w:pPr>
-                    <w:spacing w:after="0" w:before="0" w:line="252" w:lineRule="auto"/>
-                    <w:jc w:val="left"/>
-                  </w:pPr>
-                  <w:r>
-                    <w:rPr>
-                      <w:rFonts w:ascii="Arial" w:cs="Arial" w:eastAsia="Arial" w:hAnsi="Arial"/>
-                      <w:b/>
-                      <w:bCs/>
-                      <w:color w:val="0F172A"/>
-                      <w:sz w:val="17"/>
-                      <w:szCs w:val="17"/>
-                    </w:rPr>
-                    <w:t xml:space="preserve">Conditions: </w:t>
-                  </w:r>
-                  <w:r>
-                    <w:rPr>
-                      <w:rFonts w:ascii="Arial" w:cs="Arial" w:eastAsia="Arial" w:hAnsi="Arial"/>
-                      <w:b w:val="false"/>
-                      <w:bCs w:val="false"/>
-                      <w:color w:val="0F172A"/>
-                      <w:sz w:val="17"/>
-                      <w:szCs w:val="17"/>
-                    </w:rPr>
-                    <w:t xml:space="preserve">-</w:t>
+                    <w:t xml:space="preserve">Risk reason category: </w:t>
+                  </w:r>
+                  <w:r>
+                    <w:rPr>
+                      <w:rFonts w:ascii="Arial" w:cs="Arial" w:eastAsia="Arial" w:hAnsi="Arial"/>
+                      <w:b w:val="false"/>
+                      <w:bCs w:val="false"/>
+                      <w:color w:val="0F172A"/>
+                      <w:sz w:val="17"/>
+                      <w:szCs w:val="17"/>
+                    </w:rPr>
+                    <w:t xml:space="preserve">PEP exposure</w:t>
                   </w:r>
                 </w:p>
               </w:tc>
             </w:tr>
             <w:tr>
               <w:trPr>
-                <w:cantSplit/>
+                <w:cantSplit w:val="off"/>
                 <w:trHeight w:val="400" w:hRule="atLeast"/>
               </w:trPr>
               <w:tc>
@@ -9661,52 +9619,221 @@
                       <w:sz w:val="17"/>
                       <w:szCs w:val="17"/>
                     </w:rPr>
-                    <w:t xml:space="preserve">Comments: </w:t>
-                  </w:r>
-                  <w:r>
-                    <w:rPr>
-                      <w:rFonts w:ascii="Arial" w:cs="Arial" w:eastAsia="Arial" w:hAnsi="Arial"/>
-                      <w:b w:val="false"/>
-                      <w:bCs w:val="false"/>
-                      <w:color w:val="0F172A"/>
-                      <w:sz w:val="17"/>
-                      <w:szCs w:val="17"/>
-                    </w:rPr>
-                    <w:t xml:space="preserve">Approve to proceed with the EL.</w:t>
-                  </w:r>
-                </w:p>
-                <w:p>
-                  <w:pPr>
-                    <w:spacing w:after="0" w:before="0" w:line="252" w:lineRule="auto"/>
-                    <w:jc w:val="left"/>
-                  </w:pPr>
-                  <w:r>
-                    <w:rPr>
-                      <w:rFonts w:ascii="Arial" w:cs="Arial" w:eastAsia="Arial" w:hAnsi="Arial"/>
-                      <w:b w:val="false"/>
-                      <w:bCs w:val="false"/>
-                      <w:color w:val="0F172A"/>
-                      <w:sz w:val="17"/>
-                      <w:szCs w:val="17"/>
-                    </w:rPr>
-                    <w:t xml:space="preserve"/>
-                  </w:r>
-                </w:p>
-                <w:p>
-                  <w:pPr>
-                    <w:spacing w:after="0" w:before="0" w:line="252" w:lineRule="auto"/>
-                    <w:jc w:val="left"/>
-                  </w:pPr>
-                  <w:r>
-                    <w:rPr>
-                      <w:rFonts w:ascii="Arial" w:cs="Arial" w:eastAsia="Arial" w:hAnsi="Arial"/>
-                      <w:b w:val="false"/>
-                      <w:bCs w:val="false"/>
-                      <w:color w:val="0F172A"/>
-                      <w:sz w:val="17"/>
-                      <w:szCs w:val="17"/>
-                    </w:rPr>
-                    <w:t xml:space="preserve">Low Risk.</w:t>
+                    <w:t xml:space="preserve">Risk explanation: </w:t>
+                  </w:r>
+                  <w:r>
+                    <w:rPr>
+                      <w:rFonts w:ascii="Arial" w:cs="Arial" w:eastAsia="Arial" w:hAnsi="Arial"/>
+                      <w:b w:val="false"/>
+                      <w:bCs w:val="false"/>
+                      <w:color w:val="0F172A"/>
+                      <w:sz w:val="17"/>
+                      <w:szCs w:val="17"/>
+                    </w:rPr>
+                    <w:t xml:space="preserve">Beneficial person is a domestic PEP.</w:t>
+                  </w:r>
+                </w:p>
+              </w:tc>
+            </w:tr>
+            <w:tr>
+              <w:trPr>
+                <w:cantSplit w:val="off"/>
+                <w:trHeight w:val="400" w:hRule="atLeast"/>
+              </w:trPr>
+              <w:tc>
+                <w:tcPr>
+                  <w:tcW w:type="dxa" w:w="9976"/>
+                  <w:gridSpan w:val="2"/>
+                  <w:tcMar>
+                    <w:top w:type="dxa" w:w="50"/>
+                    <w:left w:type="dxa" w:w="80"/>
+                    <w:bottom w:type="dxa" w:w="40"/>
+                    <w:right w:type="dxa" w:w="80"/>
+                  </w:tcMar>
+                </w:tcPr>
+                <w:p>
+                  <w:pPr>
+                    <w:spacing w:after="0" w:before="0" w:line="252" w:lineRule="auto"/>
+                    <w:jc w:val="left"/>
+                  </w:pPr>
+                  <w:r>
+                    <w:rPr>
+                      <w:rFonts w:ascii="Arial" w:cs="Arial" w:eastAsia="Arial" w:hAnsi="Arial"/>
+                      <w:b/>
+                      <w:bCs/>
+                      <w:color w:val="0F172A"/>
+                      <w:sz w:val="17"/>
+                      <w:szCs w:val="17"/>
+                    </w:rPr>
+                    <w:t xml:space="preserve">Conditions: </w:t>
+                  </w:r>
+                  <w:r>
+                    <w:rPr>
+                      <w:rFonts w:ascii="Arial" w:cs="Arial" w:eastAsia="Arial" w:hAnsi="Arial"/>
+                      <w:b w:val="false"/>
+                      <w:bCs w:val="false"/>
+                      <w:color w:val="0F172A"/>
+                      <w:sz w:val="17"/>
+                      <w:szCs w:val="17"/>
+                    </w:rPr>
+                    <w:t xml:space="preserve">-</w:t>
+                  </w:r>
+                </w:p>
+              </w:tc>
+            </w:tr>
+            <w:tr>
+              <w:trPr>
+                <w:cantSplit w:val="off"/>
+                <w:trHeight w:val="400" w:hRule="atLeast"/>
+              </w:trPr>
+              <w:tc>
+                <w:tcPr>
+                  <w:tcW w:type="dxa" w:w="9976"/>
+                  <w:gridSpan w:val="2"/>
+                  <w:tcMar>
+                    <w:top w:type="dxa" w:w="50"/>
+                    <w:left w:type="dxa" w:w="80"/>
+                    <w:bottom w:type="dxa" w:w="40"/>
+                    <w:right w:type="dxa" w:w="80"/>
+                  </w:tcMar>
+                </w:tcPr>
+                <w:p>
+                  <w:pPr>
+                    <w:keepNext/>
+                    <w:spacing w:after="0" w:before="0" w:line="252" w:lineRule="auto"/>
+                    <w:jc w:val="left"/>
+                  </w:pPr>
+                  <w:r>
+                    <w:rPr>
+                      <w:rFonts w:ascii="Arial" w:cs="Arial" w:eastAsia="Arial" w:hAnsi="Arial"/>
+                      <w:b/>
+                      <w:bCs/>
+                      <w:color w:val="0F172A"/>
+                      <w:sz w:val="17"/>
+                      <w:szCs w:val="17"/>
+                    </w:rPr>
+                    <w:t xml:space="preserve">Comments:</w:t>
+                  </w:r>
+                </w:p>
+                <w:p>
+                  <w:pPr>
+                    <w:spacing w:after="80" w:before="0" w:line="252" w:lineRule="auto"/>
+                    <w:jc w:val="left"/>
+                  </w:pPr>
+                  <w:r>
+                    <w:rPr>
+                      <w:rFonts w:ascii="Arial" w:cs="Arial" w:eastAsia="Arial" w:hAnsi="Arial"/>
+                      <w:b/>
+                      <w:bCs/>
+                      <w:i w:val="false"/>
+                      <w:iCs w:val="false"/>
+                      <w:color w:val="0F172A"/>
+                      <w:sz w:val="17"/>
+                      <w:szCs w:val="17"/>
+                    </w:rPr>
+                    <w:t xml:space="preserve">Enhanced due diligence completed.</w:t>
+                  </w:r>
+                  <w:r>
+                    <w:rPr>
+                      <w:rFonts w:ascii="Arial" w:cs="Arial" w:eastAsia="Arial" w:hAnsi="Arial"/>
+                      <w:b w:val="false"/>
+                      <w:bCs w:val="false"/>
+                      <w:i w:val="false"/>
+                      <w:iCs w:val="false"/>
+                      <w:color w:val="0F172A"/>
+                      <w:sz w:val="17"/>
+                      <w:szCs w:val="17"/>
+                    </w:rPr>
+                    <w:t xml:space="preserve"> </w:t>
+                  </w:r>
+                  <w:r>
+                    <w:rPr>
+                      <w:rFonts w:ascii="Arial" w:cs="Arial" w:eastAsia="Arial" w:hAnsi="Arial"/>
+                      <w:b w:val="false"/>
+                      <w:bCs w:val="false"/>
+                      <w:i w:val="false"/>
+                      <w:iCs w:val="false"/>
+                      <w:color w:val="0F172A"/>
+                      <w:sz w:val="17"/>
+                      <w:szCs w:val="17"/>
+                      <w:highlight w:val="yellow"/>
+                    </w:rPr>
+                    <w:t xml:space="preserve">Annual review required.</w:t>
+                  </w:r>
+                </w:p>
+                <w:p>
+                  <w:pPr>
+                    <w:spacing w:after="80" w:before="0" w:line="252" w:lineRule="auto"/>
+                    <w:jc w:val="left"/>
+                  </w:pPr>
+                  <w:r>
+                    <w:rPr>
+                      <w:rFonts w:ascii="Arial" w:cs="Arial" w:eastAsia="Arial" w:hAnsi="Arial"/>
+                      <w:b w:val="false"/>
+                      <w:bCs w:val="false"/>
+                      <w:i w:val="false"/>
+                      <w:iCs w:val="false"/>
+                      <w:color w:val="0F172A"/>
+                      <w:sz w:val="17"/>
+                      <w:szCs w:val="17"/>
+                    </w:rPr>
+                    <w:t xml:space="preserve">Source of wealth and ownership documentation were reviewed. This paragraph must use the full available width.</w:t>
+                  </w:r>
+                </w:p>
+                <w:p>
+                  <w:pPr>
+                    <w:spacing w:after="80" w:before="0" w:line="252" w:lineRule="auto"/>
+                    <w:jc w:val="left"/>
+                  </w:pPr>
+                  <w:r>
+                    <w:rPr>
+                      <w:rFonts w:ascii="Arial" w:cs="Arial" w:eastAsia="Arial" w:hAnsi="Arial"/>
+                      <w:color w:val="0F172A"/>
+                      <w:sz w:val="17"/>
+                      <w:szCs w:val="17"/>
+                    </w:rPr>
+                    <w:t xml:space="preserve">- </w:t>
+                  </w:r>
+                  <w:r>
+                    <w:rPr>
+                      <w:rFonts w:ascii="Arial" w:cs="Arial" w:eastAsia="Arial" w:hAnsi="Arial"/>
+                      <w:b w:val="false"/>
+                      <w:bCs w:val="false"/>
+                      <w:i w:val="false"/>
+                      <w:iCs w:val="false"/>
+                      <w:color w:val="0F172A"/>
+                      <w:sz w:val="17"/>
+                      <w:szCs w:val="17"/>
+                    </w:rPr>
+                    <w:t xml:space="preserve">Monitor changes in ownership.</w:t>
+                  </w:r>
+                </w:p>
+                <w:p>
+                  <w:pPr>
+                    <w:spacing w:after="80" w:before="0" w:line="252" w:lineRule="auto"/>
+                    <w:jc w:val="left"/>
+                  </w:pPr>
+                  <w:r>
+                    <w:rPr>
+                      <w:rFonts w:ascii="Arial" w:cs="Arial" w:eastAsia="Arial" w:hAnsi="Arial"/>
+                      <w:color w:val="0F172A"/>
+                      <w:sz w:val="17"/>
+                      <w:szCs w:val="17"/>
+                    </w:rPr>
+                    <w:t xml:space="preserve">- </w:t>
+                  </w:r>
+                  <w:r>
+                    <w:rPr>
+                      <w:rFonts w:ascii="Arial" w:cs="Arial" w:eastAsia="Arial" w:hAnsi="Arial"/>
+                      <w:b w:val="false"/>
+                      <w:bCs w:val="false"/>
+                      <w:i/>
+                      <w:iCs/>
+                      <w:color w:val="0F172A"/>
+                      <w:sz w:val="17"/>
+                      <w:szCs w:val="17"/>
+                    </w:rPr>
+                    <w:t xml:space="preserve">Escalate material risk changes.</w:t>
                   </w:r>
                 </w:p>
               </w:tc>
@@ -9955,12 +10082,13 @@
             </w:tr>
             <w:tr>
               <w:trPr>
-                <w:cantSplit/>
+                <w:cantSplit w:val="off"/>
                 <w:trHeight w:val="400" w:hRule="atLeast"/>
               </w:trPr>
               <w:tc>
                 <w:tcPr>
-                  <w:tcW w:type="dxa" w:w="4988"/>
+                  <w:tcW w:type="dxa" w:w="9976"/>
+                  <w:gridSpan w:val="2"/>
                   <w:tcMar>
                     <w:top w:type="dxa" w:w="50"/>
                     <w:left w:type="dxa" w:w="80"/>
@@ -9997,18 +10125,26 @@
                   </w:r>
                 </w:p>
               </w:tc>
-              <w:tc>
-                <w:tcPr>
-                  <w:tcW w:type="dxa" w:w="4988"/>
-                  <w:tcMar>
-                    <w:top w:type="dxa" w:w="50"/>
-                    <w:left w:type="dxa" w:w="80"/>
-                    <w:bottom w:type="dxa" w:w="40"/>
-                    <w:right w:type="dxa" w:w="80"/>
-                  </w:tcMar>
-                </w:tcPr>
-                <w:p>
-                  <w:pPr>
+            </w:tr>
+            <w:tr>
+              <w:trPr>
+                <w:cantSplit w:val="off"/>
+                <w:trHeight w:val="400" w:hRule="atLeast"/>
+              </w:trPr>
+              <w:tc>
+                <w:tcPr>
+                  <w:tcW w:type="dxa" w:w="9976"/>
+                  <w:gridSpan w:val="2"/>
+                  <w:tcMar>
+                    <w:top w:type="dxa" w:w="50"/>
+                    <w:left w:type="dxa" w:w="80"/>
+                    <w:bottom w:type="dxa" w:w="40"/>
+                    <w:right w:type="dxa" w:w="80"/>
+                  </w:tcMar>
+                </w:tcPr>
+                <w:p>
+                  <w:pPr>
+                    <w:keepNext/>
                     <w:spacing w:after="0" w:before="0" w:line="252" w:lineRule="auto"/>
                     <w:jc w:val="left"/>
                   </w:pPr>
@@ -10021,13 +10157,17 @@
                       <w:sz w:val="17"/>
                       <w:szCs w:val="17"/>
                     </w:rPr>
-                    <w:t xml:space="preserve">Comments: </w:t>
-                  </w:r>
-                  <w:r>
-                    <w:rPr>
-                      <w:rFonts w:ascii="Arial" w:cs="Arial" w:eastAsia="Arial" w:hAnsi="Arial"/>
-                      <w:b w:val="false"/>
-                      <w:bCs w:val="false"/>
+                    <w:t xml:space="preserve">Comments:</w:t>
+                  </w:r>
+                </w:p>
+                <w:p>
+                  <w:pPr>
+                    <w:spacing w:after="80" w:before="0" w:line="252" w:lineRule="auto"/>
+                    <w:jc w:val="left"/>
+                  </w:pPr>
+                  <w:r>
+                    <w:rPr>
+                      <w:rFonts w:ascii="Arial" w:cs="Arial" w:eastAsia="Arial" w:hAnsi="Arial"/>
                       <w:color w:val="0F172A"/>
                       <w:sz w:val="17"/>
                       <w:szCs w:val="17"/>

</xml_diff>